<commit_message>
feat: lógica de templates dinâmicos e pasta de outputs
</commit_message>
<xml_diff>
--- a/template.docx
+++ b/template.docx
@@ -192,7 +192,7 @@
           <w:sz w:val="64"/>
           <w:szCs w:val="64"/>
         </w:rPr>
-        <w:t>0</w:t>
+        <w:t>XX</w:t>
       </w:r>
       <w:r>
         <w:rPr>
@@ -201,7 +201,7 @@
           <w:sz w:val="64"/>
           <w:szCs w:val="64"/>
         </w:rPr>
-        <w:t>5</w:t>
+        <w:t xml:space="preserve"> | </w:t>
       </w:r>
       <w:r>
         <w:rPr>
@@ -210,7 +210,7 @@
           <w:sz w:val="64"/>
           <w:szCs w:val="64"/>
         </w:rPr>
-        <w:t xml:space="preserve"> | 202</w:t>
+        <w:t>20</w:t>
       </w:r>
       <w:r>
         <w:rPr>
@@ -219,7 +219,7 @@
           <w:sz w:val="64"/>
           <w:szCs w:val="64"/>
         </w:rPr>
-        <w:t>5</w:t>
+        <w:t>XX</w:t>
       </w:r>
     </w:p>
     <w:p>

</xml_diff>